<commit_message>
Housekeeping: remove backups and misplaced files from generators/
</commit_message>
<xml_diff>
--- a/data/outputs/docx/Grade 10 Bio/Bio 2.1 Plant Nutrition/docx/Biology_PlantNutrition_FinalExplanation.docx
+++ b/data/outputs/docx/Grade 10 Bio/Bio 2.1 Plant Nutrition/docx/Biology_PlantNutrition_FinalExplanation.docx
@@ -70,6 +70,7 @@
           <w:insideH w:val="single" w:color="auto" w:sz="4"/>
           <w:insideV w:val="single" w:color="auto" w:sz="4"/>
         </w:tblBorders>
+        <w:tblLayout w:type="fixed"/>
       </w:tblPr>
       <w:tblGrid>
         <w:gridCol w:w="3000"/>
@@ -374,6 +375,7 @@
           <w:insideH w:val="single" w:color="auto" w:sz="4"/>
           <w:insideV w:val="single" w:color="auto" w:sz="4"/>
         </w:tblBorders>
+        <w:tblLayout w:type="fixed"/>
       </w:tblPr>
       <w:tblGrid>
         <w:gridCol w:w="13680"/>
@@ -718,6 +720,7 @@
           <w:insideH w:val="single" w:color="auto" w:sz="4"/>
           <w:insideV w:val="single" w:color="auto" w:sz="4"/>
         </w:tblBorders>
+        <w:tblLayout w:type="fixed"/>
       </w:tblPr>
       <w:tblGrid>
         <w:gridCol w:w="13680"/>
@@ -1045,6 +1048,7 @@
           <w:insideH w:val="single" w:color="auto" w:sz="4"/>
           <w:insideV w:val="single" w:color="auto" w:sz="4"/>
         </w:tblBorders>
+        <w:tblLayout w:type="fixed"/>
       </w:tblPr>
       <w:tblGrid>
         <w:gridCol w:w="13680"/>
@@ -1334,6 +1338,7 @@
           <w:insideH w:val="single" w:color="auto" w:sz="4"/>
           <w:insideV w:val="single" w:color="auto" w:sz="4"/>
         </w:tblBorders>
+        <w:tblLayout w:type="fixed"/>
       </w:tblPr>
       <w:tblGrid>
         <w:gridCol w:w="13680"/>
@@ -1718,6 +1723,7 @@
           <w:insideH w:val="single" w:color="auto" w:sz="4"/>
           <w:insideV w:val="single" w:color="auto" w:sz="4"/>
         </w:tblBorders>
+        <w:tblLayout w:type="fixed"/>
       </w:tblPr>
       <w:tblGrid>
         <w:gridCol w:w="13680"/>
@@ -2102,6 +2108,7 @@
           <w:insideH w:val="single" w:color="auto" w:sz="4"/>
           <w:insideV w:val="single" w:color="auto" w:sz="4"/>
         </w:tblBorders>
+        <w:tblLayout w:type="fixed"/>
       </w:tblPr>
       <w:tblGrid>
         <w:gridCol w:w="13680"/>
@@ -2389,6 +2396,7 @@
           <w:insideH w:val="single" w:color="auto" w:sz="4"/>
           <w:insideV w:val="single" w:color="auto" w:sz="4"/>
         </w:tblBorders>
+        <w:tblLayout w:type="fixed"/>
       </w:tblPr>
       <w:tblGrid>
         <w:gridCol w:w="3000"/>

</xml_diff>